<commit_message>
Agrega capturas de pruebas del frontend al informe 2.4
Incluye resultado de 66 pruebas y búsqueda de donantes, con pies de figura y formato del informe.
</commit_message>
<xml_diff>
--- a/Fase 2/Evidencias Grupales/2.4_GuiaEstudiante_Fase 2_DesarrolloProyecto APT (Español).docx
+++ b/Fase 2/Evidencias Grupales/2.4_GuiaEstudiante_Fase 2_DesarrolloProyecto APT (Español).docx
@@ -6098,6 +6098,148 @@
           <w:szCs w:val="20"/>
         </w:rPr>
         <w:t>: 9 archivos y 60 pruebas aprobadas.</w:t>
+      </w:r>
+    </w:p>
+    <w:p>
+      <w:pPr>
+        <w:pStyle w:val="Ttulo3"/>
+        <w:keepNext/>
+        <w:spacing w:before="220" w:after="100"/>
+      </w:pPr>
+      <w:pPr>
+        <w:pStyle w:val="Ttulo3"/>
+      </w:pPr>
+      <w:r>
+        <w:rPr>
+          <w:b/>
+          <w:bCs/>
+          <w:color w:val="2F5D8C"/>
+        </w:rPr>
+        <w:t>Evidencia de las pruebas del frontend</w:t>
+      </w:r>
+    </w:p>
+    <w:p>
+      <w:pPr>
+        <w:spacing w:after="140" w:line="360" w:lineRule="auto"/>
+        <w:jc w:val="both"/>
+      </w:pPr>
+      <w:pPr/>
+      <w:r>
+        <w:t>El 18 de octubre de 2026 se verificó el frontend en el computador de Paulina. La suite automatizada aprobó 66 pruebas en 14 archivos. También se comprobó manualmente la búsqueda de donantes desde la interfaz. Las figuras siguientes muestran resultados de ambas verificaciones; la evidencia completa se encuentra en el Anexo A.</w:t>
+      </w:r>
+    </w:p>
+    <w:p>
+      <w:pPr>
+        <w:keepNext/>
+        <w:jc w:val="center"/>
+      </w:pPr>
+      <w:r>
+        <w:drawing>
+          <wp:inline xmlns:a="http://schemas.openxmlformats.org/drawingml/2006/main" xmlns:pic="http://schemas.openxmlformats.org/drawingml/2006/picture">
+            <wp:extent cx="5024111" cy="3291839"/>
+            <wp:docPr id="1257897411" name="Picture 1257897411" descr="Figura 4. Suite automatizada del frontend ejecutada en el entorno local: 66 pruebas aprobadas en 14 archivos."/>
+            <wp:cNvGraphicFramePr>
+              <a:graphicFrameLocks noChangeAspect="1"/>
+            </wp:cNvGraphicFramePr>
+            <a:graphic>
+              <a:graphicData uri="http://schemas.openxmlformats.org/drawingml/2006/picture">
+                <pic:pic>
+                  <pic:nvPicPr>
+                    <pic:cNvPr id="0" name="image(20261018-181649).png"/>
+                    <pic:cNvPicPr/>
+                  </pic:nvPicPr>
+                  <pic:blipFill>
+                    <a:blip r:embed="rId15"/>
+                    <a:stretch>
+                      <a:fillRect/>
+                    </a:stretch>
+                  </pic:blipFill>
+                  <pic:spPr>
+                    <a:xfrm>
+                      <a:off x="0" y="0"/>
+                      <a:ext cx="5024111" cy="3291839"/>
+                    </a:xfrm>
+                    <a:prstGeom prst="rect"/>
+                  </pic:spPr>
+                </pic:pic>
+              </a:graphicData>
+            </a:graphic>
+          </wp:inline>
+        </w:drawing>
+      </w:r>
+    </w:p>
+    <w:p>
+      <w:pPr>
+        <w:spacing w:before="40" w:after="220"/>
+        <w:jc w:val="center"/>
+      </w:pPr>
+      <w:pPr/>
+      <w:r>
+        <w:rPr>
+          <w:i/>
+          <w:iCs/>
+          <w:color w:val="595959"/>
+          <w:sz w:val="20"/>
+          <w:szCs w:val="20"/>
+        </w:rPr>
+        <w:t>Figura 4. Suite automatizada del frontend ejecutada en el entorno local: 66 pruebas aprobadas en 14 archivos.</w:t>
+      </w:r>
+    </w:p>
+    <w:p>
+      <w:pPr>
+        <w:keepNext/>
+        <w:jc w:val="center"/>
+      </w:pPr>
+      <w:r>
+        <w:drawing>
+          <wp:inline xmlns:a="http://schemas.openxmlformats.org/drawingml/2006/main" xmlns:pic="http://schemas.openxmlformats.org/drawingml/2006/picture">
+            <wp:extent cx="2412459" cy="3657599"/>
+            <wp:docPr id="1257897412" name="Picture 1257897412" descr="Figura 5. Prueba manual de S3-HU10: la búsqueda de Gato, grupo sanguíneo a, muestra un donante coincidente."/>
+            <wp:cNvGraphicFramePr>
+              <a:graphicFrameLocks noChangeAspect="1"/>
+            </wp:cNvGraphicFramePr>
+            <a:graphic>
+              <a:graphicData uri="http://schemas.openxmlformats.org/drawingml/2006/picture">
+                <pic:pic>
+                  <pic:nvPicPr>
+                    <pic:cNvPr id="0" name="image(20261018-182816).png"/>
+                    <pic:cNvPicPr/>
+                  </pic:nvPicPr>
+                  <pic:blipFill>
+                    <a:blip r:embed="rId16"/>
+                    <a:stretch>
+                      <a:fillRect/>
+                    </a:stretch>
+                  </pic:blipFill>
+                  <pic:spPr>
+                    <a:xfrm>
+                      <a:off x="0" y="0"/>
+                      <a:ext cx="2412459" cy="3657599"/>
+                    </a:xfrm>
+                    <a:prstGeom prst="rect"/>
+                  </pic:spPr>
+                </pic:pic>
+              </a:graphicData>
+            </a:graphic>
+          </wp:inline>
+        </w:drawing>
+      </w:r>
+    </w:p>
+    <w:p>
+      <w:pPr>
+        <w:spacing w:before="40" w:after="220"/>
+        <w:jc w:val="center"/>
+      </w:pPr>
+      <w:pPr/>
+      <w:r>
+        <w:rPr>
+          <w:i/>
+          <w:iCs/>
+          <w:color w:val="595959"/>
+          <w:sz w:val="20"/>
+          <w:szCs w:val="20"/>
+        </w:rPr>
+        <w:t>Figura 5. Prueba manual de S3-HU10: la búsqueda de Gato, grupo sanguíneo a, muestra un donante coincidente.</w:t>
       </w:r>
     </w:p>
     <w:p>

</xml_diff>